<commit_message>
Résumé: swap Nuclear Force for Berkshire Hathaway redesign
Technical Projects now lead with Resona/Wisper, followed by the
Berkshire Hathaway UX/UI redesign. Regenerated all 7 formats.

Co-Authored-By: Claude Opus 4.8 (1M context) <noreply@anthropic.com>
</commit_message>
<xml_diff>
--- a/assets/docs/resume/resume.docx
+++ b/assets/docs/resume/resume.docx
@@ -296,13 +296,13 @@
           <w:b/>
           <w:bCs/>
         </w:rPr>
-        <w:t xml:space="preserve">Nuclear Force — NYC Nuclear-Emergency Escape Router</w:t>
-      </w:r>
-      <w:r>
-        <w:t xml:space="preserve"> </w:t>
-      </w:r>
-      <w:r>
-        <w:t xml:space="preserve">· 2026 ·</w:t>
+        <w:t xml:space="preserve">Berkshire Hathaway, Reimagined — UX/UI Redesign</w:t>
+      </w:r>
+      <w:r>
+        <w:t xml:space="preserve"> </w:t>
+      </w:r>
+      <w:r>
+        <w:t xml:space="preserve">· 2025 ·</w:t>
       </w:r>
       <w:r>
         <w:t xml:space="preserve"> </w:t>
@@ -323,7 +323,7 @@
           <w:i/>
           <w:iCs/>
         </w:rPr>
-        <w:t xml:space="preserve">Interactive emergency-preparedness simulator for New York City, packaged as a native desktop app.</w:t>
+        <w:t xml:space="preserve">Conceptual redesign of berkshirehathaway.com synthesizing Apple’s HIG with Buffett’s 1996 Owner’s Manual.</w:t>
       </w:r>
     </w:p>
     <w:p>
@@ -335,7 +335,7 @@
         </w:numPr>
       </w:pPr>
       <w:r>
-        <w:t xml:space="preserve">Built a Leaflet map modeling four blast yields with a nearest-shelter finder over 17 real sites, wind-driven fallout drift, and algorithmic evacuation routing; shipped as a Windows Electron build in a pnpm monorepo.</w:t>
+        <w:t xml:space="preserve">Built a single-file HTML mockup and Figma spec organized around seven paired design principles, meeting WCAG 2.2 AA accessibility with an 8-section written design rationale.</w:t>
       </w:r>
     </w:p>
     <w:bookmarkEnd w:id="15"/>

</xml_diff>